<commit_message>
v2 and v3 additions
</commit_message>
<xml_diff>
--- a/chinese_writing_rag_pipeline/raw/iteration data/vocabulary list (errors & correct).docx
+++ b/chinese_writing_rag_pipeline/raw/iteration data/vocabulary list (errors & correct).docx
@@ -10,6 +10,19 @@
       </w:pPr>
       <w:r>
         <w:rPr>
+          <w:b/>
+        </w:rPr>
+        <w:t>Examples of vocabulary errors and their correction. These should be listed as an error not a suggestion.</w:t>
+      </w:r>
+    </w:p>
+    <w:p>
+      <w:pPr>
+        <w:rPr>
+          <w:b/>
+        </w:rPr>
+      </w:pPr>
+      <w:r>
+        <w:rPr>
           <w:rFonts w:hint="eastAsia"/>
           <w:b/>
         </w:rPr>
@@ -830,6 +843,7 @@
     </w:p>
     <w:p>
       <w:r>
+        <w:lastRenderedPageBreak/>
         <w:t>*</w:t>
       </w:r>
       <w:r>
@@ -896,7 +910,6 @@
           <w:b/>
           <w:color w:val="404040"/>
         </w:rPr>
-        <w:lastRenderedPageBreak/>
         <w:t>孟母三迁：</w:t>
       </w:r>
     </w:p>

</xml_diff>